<commit_message>
Leno: revisão Parte 5
Co-Authored-By: Claude Opus 5.5 <noreply@anthropic.com>
Claude-Session: https://claude.ai/code/session_01MJjUEEZrxQDEUifKK2vj9g
</commit_message>
<xml_diff>
--- a/roteiros/leno/Leno_Parte5.docx
+++ b/roteiros/leno/Leno_Parte5.docx
@@ -15,15 +15,7 @@
         <w:rPr>
           <w:color w:val="000000"/>
         </w:rPr>
-        <w:t>No começo dos anos dois mil, Leno deixou o Rio de Janeiro.</w:t>
-      </w:r>
-    </w:p>
-    <w:p>
-      <w:r>
-        <w:rPr>
-          <w:color w:val="000000"/>
-        </w:rPr>
-        <w:t>Voltou para Natal, a cidade onde tinha nascido.</w:t>
+        <w:t>No começo dos anos dois mil, Leno voltou para Natal, a cidade onde tinha nascido.</w:t>
       </w:r>
     </w:p>
     <w:p>
@@ -95,7 +87,7 @@
         <w:rPr>
           <w:color w:val="C00000"/>
         </w:rPr>
-        <w:t>E foi nessa mesma época que a menina da vizinhança de Copacabana voltou a cruzar o caminho dele, diante de uma multidão.</w:t>
+        <w:t>Alguns anos depois, a menina da vizinhança de Copacabana voltou a cruzar o caminho dele. Diante de uma multidão, e com o tempo já correndo contra os dois.</w:t>
       </w:r>
     </w:p>
     <w:p>
@@ -167,7 +159,7 @@
         <w:rPr>
           <w:color w:val="000000"/>
         </w:rPr>
-        <w:t>Era câncer. Ele passou um tempo em tratamento, em Natal, enquanto a doença avançava.</w:t>
+        <w:t>Era câncer. Ele passou um tempo em tratamento, enquanto a doença avançava.</w:t>
       </w:r>
     </w:p>
     <w:p>
@@ -392,14 +384,6 @@
           <w:color w:val="000000"/>
         </w:rPr>
         <w:t>Um de seus ídolos.</w:t>
-      </w:r>
-    </w:p>
-    <w:p>
-      <w:r>
-        <w:rPr>
-          <w:color w:val="000000"/>
-        </w:rPr>
-        <w:t>O menino que dublava discos estrangeiros em Copacabana foi embora no dia em que se lembra a morte de um dos ídolos dele.</w:t>
       </w:r>
     </w:p>
     <w:p>

</xml_diff>